<commit_message>
feat: implement blockchain domain models
</commit_message>
<xml_diff>
--- a/Documentation.docx
+++ b/Documentation.docx
@@ -294,11 +294,221 @@
         </w:tc>
       </w:tr>
     </w:tbl>
-    <w:p>
-      <w:r>
-        <w:t>k</w:t>
-      </w:r>
-    </w:p>
+    <w:p/>
+    <w:tbl>
+      <w:tblPr>
+        <w:tblStyle w:val="TableGrid"/>
+        <w:tblW w:w="0" w:type="auto"/>
+        <w:tblLook w:val="04A0" w:firstRow="1" w:lastRow="0" w:firstColumn="1" w:lastColumn="0" w:noHBand="0" w:noVBand="1"/>
+      </w:tblPr>
+      <w:tblGrid>
+        <w:gridCol w:w="5526"/>
+        <w:gridCol w:w="1912"/>
+        <w:gridCol w:w="1912"/>
+      </w:tblGrid>
+      <w:tr>
+        <w:trPr>
+          <w:trHeight w:val="641"/>
+        </w:trPr>
+        <w:tc>
+          <w:tcPr>
+            <w:tcW w:w="5526" w:type="dxa"/>
+            <w:vMerge w:val="restart"/>
+          </w:tcPr>
+          <w:p>
+            <w:r>
+              <w:drawing>
+                <wp:inline distT="0" distB="0" distL="0" distR="0" wp14:anchorId="3878DD80" wp14:editId="15E3C724">
+                  <wp:extent cx="3371611" cy="2061845"/>
+                  <wp:effectExtent l="0" t="0" r="635" b="0"/>
+                  <wp:docPr id="2" name="Picture 2"/>
+                  <wp:cNvGraphicFramePr>
+                    <a:graphicFrameLocks xmlns:a="http://schemas.openxmlformats.org/drawingml/2006/main" noChangeAspect="1"/>
+                  </wp:cNvGraphicFramePr>
+                  <a:graphic xmlns:a="http://schemas.openxmlformats.org/drawingml/2006/main">
+                    <a:graphicData uri="http://schemas.openxmlformats.org/drawingml/2006/picture">
+                      <pic:pic xmlns:pic="http://schemas.openxmlformats.org/drawingml/2006/picture">
+                        <pic:nvPicPr>
+                          <pic:cNvPr id="1" name=""/>
+                          <pic:cNvPicPr/>
+                        </pic:nvPicPr>
+                        <pic:blipFill rotWithShape="1">
+                          <a:blip r:embed="rId6"/>
+                          <a:srcRect l="5852"/>
+                          <a:stretch/>
+                        </pic:blipFill>
+                        <pic:spPr bwMode="auto">
+                          <a:xfrm>
+                            <a:off x="0" y="0"/>
+                            <a:ext cx="3377202" cy="2065264"/>
+                          </a:xfrm>
+                          <a:prstGeom prst="rect">
+                            <a:avLst/>
+                          </a:prstGeom>
+                          <a:ln>
+                            <a:noFill/>
+                          </a:ln>
+                          <a:extLst>
+                            <a:ext uri="{53640926-AAD7-44D8-BBD7-CCE9431645EC}">
+                              <a14:shadowObscured xmlns:a14="http://schemas.microsoft.com/office/drawing/2010/main"/>
+                            </a:ext>
+                          </a:extLst>
+                        </pic:spPr>
+                      </pic:pic>
+                    </a:graphicData>
+                  </a:graphic>
+                </wp:inline>
+              </w:drawing>
+            </w:r>
+          </w:p>
+        </w:tc>
+        <w:tc>
+          <w:tcPr>
+            <w:tcW w:w="1912" w:type="dxa"/>
+          </w:tcPr>
+          <w:p>
+            <w:r>
+              <w:t>Index</w:t>
+            </w:r>
+          </w:p>
+        </w:tc>
+        <w:tc>
+          <w:tcPr>
+            <w:tcW w:w="1912" w:type="dxa"/>
+          </w:tcPr>
+          <w:p>
+            <w:r>
+              <w:t>The block height</w:t>
+            </w:r>
+          </w:p>
+        </w:tc>
+      </w:tr>
+      <w:tr>
+        <w:trPr>
+          <w:trHeight w:val="641"/>
+        </w:trPr>
+        <w:tc>
+          <w:tcPr>
+            <w:tcW w:w="5526" w:type="dxa"/>
+            <w:vMerge/>
+          </w:tcPr>
+          <w:p/>
+        </w:tc>
+        <w:tc>
+          <w:tcPr>
+            <w:tcW w:w="1912" w:type="dxa"/>
+          </w:tcPr>
+          <w:p>
+            <w:r>
+              <w:t>Timestamp</w:t>
+            </w:r>
+          </w:p>
+        </w:tc>
+        <w:tc>
+          <w:tcPr>
+            <w:tcW w:w="1912" w:type="dxa"/>
+          </w:tcPr>
+          <w:p/>
+        </w:tc>
+      </w:tr>
+      <w:tr>
+        <w:trPr>
+          <w:trHeight w:val="642"/>
+        </w:trPr>
+        <w:tc>
+          <w:tcPr>
+            <w:tcW w:w="5526" w:type="dxa"/>
+            <w:vMerge/>
+          </w:tcPr>
+          <w:p/>
+        </w:tc>
+        <w:tc>
+          <w:tcPr>
+            <w:tcW w:w="1912" w:type="dxa"/>
+          </w:tcPr>
+          <w:p>
+            <w:r>
+              <w:t>Previous hash</w:t>
+            </w:r>
+          </w:p>
+        </w:tc>
+        <w:tc>
+          <w:tcPr>
+            <w:tcW w:w="1912" w:type="dxa"/>
+          </w:tcPr>
+          <w:p>
+            <w:r>
+              <w:t>Stores the previous block hash</w:t>
+            </w:r>
+          </w:p>
+        </w:tc>
+      </w:tr>
+      <w:tr>
+        <w:trPr>
+          <w:trHeight w:val="641"/>
+        </w:trPr>
+        <w:tc>
+          <w:tcPr>
+            <w:tcW w:w="5526" w:type="dxa"/>
+            <w:vMerge/>
+          </w:tcPr>
+          <w:p/>
+        </w:tc>
+        <w:tc>
+          <w:tcPr>
+            <w:tcW w:w="1912" w:type="dxa"/>
+          </w:tcPr>
+          <w:p>
+            <w:r>
+              <w:t>Hash</w:t>
+            </w:r>
+          </w:p>
+        </w:tc>
+        <w:tc>
+          <w:tcPr>
+            <w:tcW w:w="1912" w:type="dxa"/>
+          </w:tcPr>
+          <w:p>
+            <w:r>
+              <w:t>Stores the final has after mining</w:t>
+            </w:r>
+          </w:p>
+        </w:tc>
+      </w:tr>
+      <w:tr>
+        <w:trPr>
+          <w:trHeight w:val="642"/>
+        </w:trPr>
+        <w:tc>
+          <w:tcPr>
+            <w:tcW w:w="5526" w:type="dxa"/>
+            <w:vMerge/>
+          </w:tcPr>
+          <w:p/>
+        </w:tc>
+        <w:tc>
+          <w:tcPr>
+            <w:tcW w:w="1912" w:type="dxa"/>
+          </w:tcPr>
+          <w:p>
+            <w:r>
+              <w:t>Mining</w:t>
+            </w:r>
+          </w:p>
+        </w:tc>
+        <w:tc>
+          <w:tcPr>
+            <w:tcW w:w="1912" w:type="dxa"/>
+          </w:tcPr>
+          <w:p>
+            <w:r>
+              <w:t>Checking that transaction are valid and adding them to the blockchain</w:t>
+            </w:r>
+          </w:p>
+        </w:tc>
+      </w:tr>
+    </w:tbl>
+    <w:p/>
     <w:sectPr>
       <w:pgSz w:w="12240" w:h="15840"/>
       <w:pgMar w:top="1440" w:right="1440" w:bottom="1440" w:left="1440" w:header="720" w:footer="720" w:gutter="0"/>

</xml_diff>